<commit_message>
Prepare v2.3.0 Human Genomics manuscript and public materials
Add manuscript v42 with all figures and tables, the approved graphical abstract, revised Figure 1 labels, and version-specific GitHub and Zenodo references. Preserve the v41 aggregate analysis results and supplementary data.
</commit_message>
<xml_diff>
--- a/supplementary/Supplementary_Methods_v41.docx
+++ b/supplementary/Supplementary_Methods_v41.docx
@@ -21,7 +21,7 @@
           <w:rFonts w:ascii="Times New Roman" w:hAnsi="Times New Roman" w:eastAsia="Times New Roman" w:cs="Times New Roman"/>
           <w:color w:val="000000"/>
         </w:rPr>
-        <w:t>Immune gene expression across blood, cerebrospinal fluid and nerve in inflammatory neuropathies</w:t>
+        <w:t>Immune gene and protein profiles across blood, cerebrospinal fluid and peripheral nerve in inflammatory neuropathies</w:t>
       </w:r>
     </w:p>
     <w:p>
@@ -31,7 +31,7 @@
           <w:rFonts w:ascii="Times New Roman" w:hAnsi="Times New Roman" w:eastAsia="Times New Roman" w:cs="Times New Roman"/>
           <w:color w:val="000000"/>
         </w:rPr>
-        <w:t>Manuscript v41, 7 September 2026</w:t>
+        <w:t>Manuscript v42, 7 September 2026</w:t>
       </w:r>
     </w:p>
     <w:p>
@@ -513,7 +513,7 @@
           <w:rFonts w:ascii="Times New Roman" w:hAnsi="Times New Roman" w:eastAsia="Times New Roman" w:cs="Times New Roman"/>
           <w:color w:val="000000"/>
         </w:rPr>
-        <w:t>Repository: https://github.com/applepie567/gbs-cidp-blood-nerve-barrier</w:t>
+        <w:t>Repository release: https://github.com/applepie567/gbs-cidp-blood-nerve-barrier/releases/tag/v2.3.0</w:t>
       </w:r>
     </w:p>
     <w:p>
@@ -523,7 +523,7 @@
           <w:rFonts w:ascii="Times New Roman" w:hAnsi="Times New Roman" w:eastAsia="Times New Roman" w:cs="Times New Roman"/>
           <w:color w:val="000000"/>
         </w:rPr>
-        <w:t>The public archive accompanying manuscript v41 is version 2.2.0 at https://doi.org/10.5281/zenodo.22636223. It contains the corrected CSF synthesis and new v41 sensitivity analyses. The repository is https://github.com/applepie567/gbs-cidp-blood-nerve-barrier. The preceding v2.1.0 records at https://doi.org/10.5281/zenodo.22561445 and https://doi.org/10.5281/zenodo.22563142 remain historical versions. The earlier v2.0.0 archive is https://doi.org/10.5281/zenodo.22226674.</w:t>
+        <w:t>The public archive accompanying manuscript v42 is version 2.3.0 at https://doi.org/10.5281/zenodo.22641099. It contains the CSF synthesis, macrophage sensitivity analyses and supplementary data from v41, together with the Human Genomics manuscript and updated figures. The previous v2.2.0 archive is https://doi.org/10.5281/zenodo.22636223. Earlier versions remain available through the concept DOI https://doi.org/10.5281/zenodo.22226672.</w:t>
       </w:r>
     </w:p>
     <w:p>

</xml_diff>